<commit_message>
Add SPDP, SP3, Tahap I, and Tahap II feature files for Pusiknas Bareskrim
</commit_message>
<xml_diff>
--- a/public/word-template/berkas_perkara_tahap_I.docx
+++ b/public/word-template/berkas_perkara_tahap_I.docx
@@ -73,7 +73,7 @@
                       <w:lang w:val="en-US"/>
                     </w:rPr>
                     <w:drawing>
-                      <wp:inline distT="0" distB="0" distL="0" distR="0" wp14:anchorId="1D461AF8" wp14:editId="35632F22">
+                      <wp:inline distT="0" distB="0" distL="0" distR="0" wp14:anchorId="1D461AF8" wp14:editId="19396313">
                         <wp:extent cx="738127" cy="690404"/>
                         <wp:effectExtent l="0" t="0" r="5080" b="0"/>
                         <wp:docPr id="6" name="Picture 6"/>
@@ -749,7 +749,6 @@
                 <w:szCs w:val="24"/>
               </w:rPr>
             </w:pPr>
-            <w:proofErr w:type="spellStart"/>
             <w:r>
               <w:rPr>
                 <w:rFonts w:ascii="Arial Narrow" w:hAnsi="Arial Narrow"/>
@@ -758,7 +757,6 @@
               </w:rPr>
               <w:t>Perihal</w:t>
             </w:r>
-            <w:proofErr w:type="spellEnd"/>
           </w:p>
         </w:tc>
         <w:tc>
@@ -1658,7 +1656,6 @@
               </w:rPr>
             </w:pPr>
             <w:proofErr w:type="spellStart"/>
-            <w:proofErr w:type="gramStart"/>
             <w:r>
               <w:rPr>
                 <w:rFonts w:ascii="Arial Narrow" w:eastAsia="Times New Roman" w:hAnsi="Arial Narrow" w:cs="Fira Code"/>
@@ -1678,7 +1675,6 @@
               </w:rPr>
               <w:t xml:space="preserve"> :</w:t>
             </w:r>
-            <w:proofErr w:type="gramEnd"/>
           </w:p>
         </w:tc>
       </w:tr>
@@ -3673,7 +3669,6 @@
                     </w:rPr>
                   </w:pPr>
                   <w:proofErr w:type="spellStart"/>
-                  <w:proofErr w:type="gramStart"/>
                   <w:r>
                     <w:rPr>
                       <w:rFonts w:ascii="Arial Narrow" w:hAnsi="Arial Narrow"/>
@@ -3691,7 +3686,6 @@
                     </w:rPr>
                     <w:t xml:space="preserve"> :</w:t>
                   </w:r>
-                  <w:proofErr w:type="gramEnd"/>
                 </w:p>
               </w:tc>
             </w:tr>
@@ -4912,14 +4906,6 @@
               <w:szCs w:val="24"/>
             </w:rPr>
           </w:pPr>
-          <w:r>
-            <w:rPr>
-              <w:rFonts w:ascii="Arial Narrow" w:hAnsi="Arial Narrow"/>
-              <w:sz w:val="24"/>
-              <w:szCs w:val="24"/>
-            </w:rPr>
-            <w:t xml:space="preserve"> </w:t>
-          </w:r>
           <w:r>
             <w:rPr>
               <w:rFonts w:ascii="Arial Narrow" w:hAnsi="Arial Narrow"/>

</xml_diff>

<commit_message>
feat: implementasi integrasi pusiknas (spdp, sp3, tahap 1, tahap 2), approval status 86, serta dokumen sprint dan sket penghentian penyidikan
</commit_message>
<xml_diff>
--- a/public/word-template/berkas_perkara_tahap_I.docx
+++ b/public/word-template/berkas_perkara_tahap_I.docx
@@ -73,7 +73,7 @@
                       <w:lang w:val="en-US"/>
                     </w:rPr>
                     <w:drawing>
-                      <wp:inline distT="0" distB="0" distL="0" distR="0" wp14:anchorId="1D461AF8" wp14:editId="19396313">
+                      <wp:inline distT="0" distB="0" distL="0" distR="0" wp14:anchorId="1D461AF8" wp14:editId="78107F20">
                         <wp:extent cx="738127" cy="690404"/>
                         <wp:effectExtent l="0" t="0" r="5080" b="0"/>
                         <wp:docPr id="6" name="Picture 6"/>
@@ -1656,6 +1656,7 @@
               </w:rPr>
             </w:pPr>
             <w:proofErr w:type="spellStart"/>
+            <w:proofErr w:type="gramStart"/>
             <w:r>
               <w:rPr>
                 <w:rFonts w:ascii="Arial Narrow" w:eastAsia="Times New Roman" w:hAnsi="Arial Narrow" w:cs="Fira Code"/>
@@ -1675,6 +1676,7 @@
               </w:rPr>
               <w:t xml:space="preserve"> :</w:t>
             </w:r>
+            <w:proofErr w:type="gramEnd"/>
           </w:p>
         </w:tc>
       </w:tr>
@@ -3669,6 +3671,7 @@
                     </w:rPr>
                   </w:pPr>
                   <w:proofErr w:type="spellStart"/>
+                  <w:proofErr w:type="gramStart"/>
                   <w:r>
                     <w:rPr>
                       <w:rFonts w:ascii="Arial Narrow" w:hAnsi="Arial Narrow"/>
@@ -3686,6 +3689,7 @@
                     </w:rPr>
                     <w:t xml:space="preserve"> :</w:t>
                   </w:r>
+                  <w:proofErr w:type="gramEnd"/>
                 </w:p>
               </w:tc>
             </w:tr>
@@ -3902,7 +3906,7 @@
               <w:tblLook w:val="04A0" w:firstRow="1" w:lastRow="0" w:firstColumn="1" w:lastColumn="0" w:noHBand="0" w:noVBand="1"/>
             </w:tblPr>
             <w:tblGrid>
-              <w:gridCol w:w="4763"/>
+              <w:gridCol w:w="5330"/>
             </w:tblGrid>
             <w:tr>
               <w:trPr>
@@ -3910,7 +3914,7 @@
               </w:trPr>
               <w:tc>
                 <w:tcPr>
-                  <w:tcW w:w="4763" w:type="dxa"/>
+                  <w:tcW w:w="5330" w:type="dxa"/>
                 </w:tcPr>
                 <w:p>
                   <w:pPr>
@@ -3964,7 +3968,7 @@
               </w:trPr>
               <w:tc>
                 <w:tcPr>
-                  <w:tcW w:w="4763" w:type="dxa"/>
+                  <w:tcW w:w="5330" w:type="dxa"/>
                 </w:tcPr>
                 <w:p>
                   <w:pPr>
@@ -4028,7 +4032,7 @@
               </w:trPr>
               <w:tc>
                 <w:tcPr>
-                  <w:tcW w:w="4763" w:type="dxa"/>
+                  <w:tcW w:w="5330" w:type="dxa"/>
                 </w:tcPr>
                 <w:p>
                   <w:pPr>
@@ -4050,7 +4054,7 @@
               </w:trPr>
               <w:tc>
                 <w:tcPr>
-                  <w:tcW w:w="4763" w:type="dxa"/>
+                  <w:tcW w:w="5330" w:type="dxa"/>
                 </w:tcPr>
                 <w:p>
                   <w:pPr>
@@ -4072,7 +4076,7 @@
               </w:trPr>
               <w:tc>
                 <w:tcPr>
-                  <w:tcW w:w="4763" w:type="dxa"/>
+                  <w:tcW w:w="5330" w:type="dxa"/>
                 </w:tcPr>
                 <w:p>
                   <w:pPr>
@@ -4094,7 +4098,7 @@
               </w:trPr>
               <w:tc>
                 <w:tcPr>
-                  <w:tcW w:w="4763" w:type="dxa"/>
+                  <w:tcW w:w="5330" w:type="dxa"/>
                 </w:tcPr>
                 <w:p>
                   <w:pPr>
@@ -4116,7 +4120,7 @@
               </w:trPr>
               <w:tc>
                 <w:tcPr>
-                  <w:tcW w:w="4763" w:type="dxa"/>
+                  <w:tcW w:w="5330" w:type="dxa"/>
                 </w:tcPr>
                 <w:p>
                   <w:pPr>
@@ -4138,7 +4142,7 @@
               </w:trPr>
               <w:tc>
                 <w:tcPr>
-                  <w:tcW w:w="4763" w:type="dxa"/>
+                  <w:tcW w:w="5330" w:type="dxa"/>
                 </w:tcPr>
                 <w:p>
                   <w:pPr>
@@ -4160,7 +4164,7 @@
               </w:trPr>
               <w:tc>
                 <w:tcPr>
-                  <w:tcW w:w="4763" w:type="dxa"/>
+                  <w:tcW w:w="5330" w:type="dxa"/>
                 </w:tcPr>
                 <w:tbl>
                   <w:tblPr>
@@ -4184,7 +4188,7 @@
                     <w:tblLook w:val="04A0" w:firstRow="1" w:lastRow="0" w:firstColumn="1" w:lastColumn="0" w:noHBand="0" w:noVBand="1"/>
                   </w:tblPr>
                   <w:tblGrid>
-                    <w:gridCol w:w="4536"/>
+                    <w:gridCol w:w="5245"/>
                   </w:tblGrid>
                   <w:tr>
                     <w:trPr>
@@ -4192,7 +4196,7 @@
                     </w:trPr>
                     <w:tc>
                       <w:tcPr>
-                        <w:tcW w:w="4536" w:type="dxa"/>
+                        <w:tcW w:w="5245" w:type="dxa"/>
                         <w:tcBorders>
                           <w:bottom w:val="single" w:sz="4" w:space="0" w:color="auto"/>
                         </w:tcBorders>
@@ -4251,7 +4255,7 @@
                     </w:trPr>
                     <w:tc>
                       <w:tcPr>
-                        <w:tcW w:w="4536" w:type="dxa"/>
+                        <w:tcW w:w="5245" w:type="dxa"/>
                         <w:tcBorders>
                           <w:top w:val="single" w:sz="4" w:space="0" w:color="auto"/>
                         </w:tcBorders>

</xml_diff>